<commit_message>
Perbaiki ukuran gambar 13 modul Word Opto: cegah overflow margin & space kosong
Dosen melaporkan banyak gambar melewati batas margin kanan dan masih
banyak ruang kosong. Akar masalah: gambar disisipkan pada lebar hasil-
ukur-natural (figsize 9-11 inci @220 DPI = 21-24cm) yang jauh melebihi
kolom teks A4 (15,5cm), sehingga bleed lewat margin; gambar tinggi
(multi-panel/donut) memicu page-break dan gap besar.

Fix di word_lib.gambar(): abaikan width_cm caller, hitung dari piksel
PNG lalu clamp keras lebar min(15,2cm, natural) dan tinggi maks 12,5cm
(aspect ratio dijaga; cover banner template tidak lewat gambar() jadi
tetap full-bleed). Semua 13 modul (Pertemuan 2-15) di-rebuild.

Verifikasi terprogram wp:extent: 0 gambar overflow (maxW=15,2cm,
maxH<=12,5cm di semua modul), validate.py PASSED, em-dash=0, penomoran
Gambar/Tabel tetap sekuensial. Pedoman §40.5 dikoreksi dgn aturan clamp.
</commit_message>
<xml_diff>
--- a/Optimalisasi-dan-Automasi/Modul-Word/Modul-10-Optimasi-Berbasis-ANOVA.docx
+++ b/Optimalisasi-dan-Automasi/Modul-Word/Modul-10-Optimasi-Berbasis-ANOVA.docx
@@ -2667,7 +2667,7 @@
       <w:r>
         <w:drawing>
           <wp:inline xmlns:a="http://schemas.openxmlformats.org/drawingml/2006/main" xmlns:pic="http://schemas.openxmlformats.org/drawingml/2006/picture">
-            <wp:extent cx="6912032" cy="1936865"/>
+            <wp:extent cx="5472000" cy="1533344"/>
             <wp:docPr id="1858245148" name="Picture 1858245148"/>
             <wp:cNvGraphicFramePr>
               <a:graphicFrameLocks noChangeAspect="1"/>
@@ -2688,7 +2688,7 @@
                   <pic:spPr>
                     <a:xfrm>
                       <a:off x="0" y="0"/>
-                      <a:ext cx="6912032" cy="1936865"/>
+                      <a:ext cx="5472000" cy="1533344"/>
                     </a:xfrm>
                     <a:prstGeom prst="rect"/>
                   </pic:spPr>
@@ -2866,7 +2866,7 @@
       <w:r>
         <w:drawing>
           <wp:inline xmlns:a="http://schemas.openxmlformats.org/drawingml/2006/main" xmlns:pic="http://schemas.openxmlformats.org/drawingml/2006/picture">
-            <wp:extent cx="7701741" cy="4584469"/>
+            <wp:extent cx="5472000" cy="3257213"/>
             <wp:docPr id="1858245149" name="Picture 1858245149"/>
             <wp:cNvGraphicFramePr>
               <a:graphicFrameLocks noChangeAspect="1"/>
@@ -2887,7 +2887,7 @@
                   <pic:spPr>
                     <a:xfrm>
                       <a:off x="0" y="0"/>
-                      <a:ext cx="7701741" cy="4584469"/>
+                      <a:ext cx="5472000" cy="3257213"/>
                     </a:xfrm>
                     <a:prstGeom prst="rect"/>
                   </pic:spPr>
@@ -2962,7 +2962,7 @@
       <w:r>
         <w:drawing>
           <wp:inline xmlns:a="http://schemas.openxmlformats.org/drawingml/2006/main" xmlns:pic="http://schemas.openxmlformats.org/drawingml/2006/picture">
-            <wp:extent cx="7701741" cy="4039985"/>
+            <wp:extent cx="5472000" cy="2870364"/>
             <wp:docPr id="1858245150" name="Picture 1858245150"/>
             <wp:cNvGraphicFramePr>
               <a:graphicFrameLocks noChangeAspect="1"/>
@@ -2983,7 +2983,7 @@
                   <pic:spPr>
                     <a:xfrm>
                       <a:off x="0" y="0"/>
-                      <a:ext cx="7701741" cy="4039985"/>
+                      <a:ext cx="5472000" cy="2870364"/>
                     </a:xfrm>
                     <a:prstGeom prst="rect"/>
                   </pic:spPr>
@@ -3834,7 +3834,7 @@
       <w:r>
         <w:drawing>
           <wp:inline xmlns:a="http://schemas.openxmlformats.org/drawingml/2006/main" xmlns:pic="http://schemas.openxmlformats.org/drawingml/2006/picture">
-            <wp:extent cx="7335981" cy="4218709"/>
+            <wp:extent cx="5472000" cy="3146788"/>
             <wp:docPr id="1858245151" name="Picture 1858245151"/>
             <wp:cNvGraphicFramePr>
               <a:graphicFrameLocks noChangeAspect="1"/>
@@ -3855,7 +3855,7 @@
                   <pic:spPr>
                     <a:xfrm>
                       <a:off x="0" y="0"/>
-                      <a:ext cx="7335981" cy="4218709"/>
+                      <a:ext cx="5472000" cy="3146788"/>
                     </a:xfrm>
                     <a:prstGeom prst="rect"/>
                   </pic:spPr>
@@ -4748,7 +4748,7 @@
       <w:r>
         <w:drawing>
           <wp:inline xmlns:a="http://schemas.openxmlformats.org/drawingml/2006/main" xmlns:pic="http://schemas.openxmlformats.org/drawingml/2006/picture">
-            <wp:extent cx="7518861" cy="4401589"/>
+            <wp:extent cx="5472000" cy="3203344"/>
             <wp:docPr id="1858245152" name="Picture 1858245152"/>
             <wp:cNvGraphicFramePr>
               <a:graphicFrameLocks noChangeAspect="1"/>
@@ -4769,7 +4769,7 @@
                   <pic:spPr>
                     <a:xfrm>
                       <a:off x="0" y="0"/>
-                      <a:ext cx="7518861" cy="4401589"/>
+                      <a:ext cx="5472000" cy="3203344"/>
                     </a:xfrm>
                     <a:prstGeom prst="rect"/>
                   </pic:spPr>
@@ -4820,7 +4820,7 @@
       <w:r>
         <w:drawing>
           <wp:inline xmlns:a="http://schemas.openxmlformats.org/drawingml/2006/main" xmlns:pic="http://schemas.openxmlformats.org/drawingml/2006/picture">
-            <wp:extent cx="6783185" cy="4563687"/>
+            <wp:extent cx="5472000" cy="3681529"/>
             <wp:docPr id="1858245153" name="Picture 1858245153"/>
             <wp:cNvGraphicFramePr>
               <a:graphicFrameLocks noChangeAspect="1"/>
@@ -4841,7 +4841,7 @@
                   <pic:spPr>
                     <a:xfrm>
                       <a:off x="0" y="0"/>
-                      <a:ext cx="6783185" cy="4563687"/>
+                      <a:ext cx="5472000" cy="3681529"/>
                     </a:xfrm>
                     <a:prstGeom prst="rect"/>
                   </pic:spPr>
@@ -5354,7 +5354,7 @@
       <w:r>
         <w:drawing>
           <wp:inline xmlns:a="http://schemas.openxmlformats.org/drawingml/2006/main" xmlns:pic="http://schemas.openxmlformats.org/drawingml/2006/picture">
-            <wp:extent cx="8246225" cy="3121429"/>
+            <wp:extent cx="5472000" cy="2071307"/>
             <wp:docPr id="1858245154" name="Picture 1858245154"/>
             <wp:cNvGraphicFramePr>
               <a:graphicFrameLocks noChangeAspect="1"/>
@@ -5375,7 +5375,7 @@
                   <pic:spPr>
                     <a:xfrm>
                       <a:off x="0" y="0"/>
-                      <a:ext cx="8246225" cy="3121429"/>
+                      <a:ext cx="5472000" cy="2071307"/>
                     </a:xfrm>
                     <a:prstGeom prst="rect"/>
                   </pic:spPr>
@@ -5596,7 +5596,7 @@
       <w:r>
         <w:drawing>
           <wp:inline xmlns:a="http://schemas.openxmlformats.org/drawingml/2006/main" xmlns:pic="http://schemas.openxmlformats.org/drawingml/2006/picture">
-            <wp:extent cx="4060767" cy="5469774"/>
+            <wp:extent cx="3340805" cy="4499999"/>
             <wp:docPr id="1858245155" name="Picture 1858245155"/>
             <wp:cNvGraphicFramePr>
               <a:graphicFrameLocks noChangeAspect="1"/>
@@ -5617,7 +5617,7 @@
                   <pic:spPr>
                     <a:xfrm>
                       <a:off x="0" y="0"/>
-                      <a:ext cx="4060767" cy="5469774"/>
+                      <a:ext cx="3340805" cy="4499999"/>
                     </a:xfrm>
                     <a:prstGeom prst="rect"/>
                   </pic:spPr>

</xml_diff>

<commit_message>
Perbaiki ukuran gambar 13 modul Word Opto: cegah overflow margin & space kosong (#641)
Dosen melaporkan banyak gambar melewati batas margin kanan dan masih
banyak ruang kosong. Akar masalah: gambar disisipkan pada lebar hasil-
ukur-natural (figsize 9-11 inci @220 DPI = 21-24cm) yang jauh melebihi
kolom teks A4 (15,5cm), sehingga bleed lewat margin; gambar tinggi
(multi-panel/donut) memicu page-break dan gap besar.

Fix di word_lib.gambar(): abaikan width_cm caller, hitung dari piksel
PNG lalu clamp keras lebar min(15,2cm, natural) dan tinggi maks 12,5cm
(aspect ratio dijaga; cover banner template tidak lewat gambar() jadi
tetap full-bleed). Semua 13 modul (Pertemuan 2-15) di-rebuild.

Verifikasi terprogram wp:extent: 0 gambar overflow (maxW=15,2cm,
maxH<=12,5cm di semua modul), validate.py PASSED, em-dash=0, penomoran
Gambar/Tabel tetap sekuensial. Pedoman §40.5 dikoreksi dgn aturan clamp.

Co-authored-by: Claude <noreply@anthropic.com>
</commit_message>
<xml_diff>
--- a/Optimalisasi-dan-Automasi/Modul-Word/Modul-10-Optimasi-Berbasis-ANOVA.docx
+++ b/Optimalisasi-dan-Automasi/Modul-Word/Modul-10-Optimasi-Berbasis-ANOVA.docx
@@ -2667,7 +2667,7 @@
       <w:r>
         <w:drawing>
           <wp:inline xmlns:a="http://schemas.openxmlformats.org/drawingml/2006/main" xmlns:pic="http://schemas.openxmlformats.org/drawingml/2006/picture">
-            <wp:extent cx="6912032" cy="1936865"/>
+            <wp:extent cx="5472000" cy="1533344"/>
             <wp:docPr id="1858245148" name="Picture 1858245148"/>
             <wp:cNvGraphicFramePr>
               <a:graphicFrameLocks noChangeAspect="1"/>
@@ -2688,7 +2688,7 @@
                   <pic:spPr>
                     <a:xfrm>
                       <a:off x="0" y="0"/>
-                      <a:ext cx="6912032" cy="1936865"/>
+                      <a:ext cx="5472000" cy="1533344"/>
                     </a:xfrm>
                     <a:prstGeom prst="rect"/>
                   </pic:spPr>
@@ -2866,7 +2866,7 @@
       <w:r>
         <w:drawing>
           <wp:inline xmlns:a="http://schemas.openxmlformats.org/drawingml/2006/main" xmlns:pic="http://schemas.openxmlformats.org/drawingml/2006/picture">
-            <wp:extent cx="7701741" cy="4584469"/>
+            <wp:extent cx="5472000" cy="3257213"/>
             <wp:docPr id="1858245149" name="Picture 1858245149"/>
             <wp:cNvGraphicFramePr>
               <a:graphicFrameLocks noChangeAspect="1"/>
@@ -2887,7 +2887,7 @@
                   <pic:spPr>
                     <a:xfrm>
                       <a:off x="0" y="0"/>
-                      <a:ext cx="7701741" cy="4584469"/>
+                      <a:ext cx="5472000" cy="3257213"/>
                     </a:xfrm>
                     <a:prstGeom prst="rect"/>
                   </pic:spPr>
@@ -2962,7 +2962,7 @@
       <w:r>
         <w:drawing>
           <wp:inline xmlns:a="http://schemas.openxmlformats.org/drawingml/2006/main" xmlns:pic="http://schemas.openxmlformats.org/drawingml/2006/picture">
-            <wp:extent cx="7701741" cy="4039985"/>
+            <wp:extent cx="5472000" cy="2870364"/>
             <wp:docPr id="1858245150" name="Picture 1858245150"/>
             <wp:cNvGraphicFramePr>
               <a:graphicFrameLocks noChangeAspect="1"/>
@@ -2983,7 +2983,7 @@
                   <pic:spPr>
                     <a:xfrm>
                       <a:off x="0" y="0"/>
-                      <a:ext cx="7701741" cy="4039985"/>
+                      <a:ext cx="5472000" cy="2870364"/>
                     </a:xfrm>
                     <a:prstGeom prst="rect"/>
                   </pic:spPr>
@@ -3834,7 +3834,7 @@
       <w:r>
         <w:drawing>
           <wp:inline xmlns:a="http://schemas.openxmlformats.org/drawingml/2006/main" xmlns:pic="http://schemas.openxmlformats.org/drawingml/2006/picture">
-            <wp:extent cx="7335981" cy="4218709"/>
+            <wp:extent cx="5472000" cy="3146788"/>
             <wp:docPr id="1858245151" name="Picture 1858245151"/>
             <wp:cNvGraphicFramePr>
               <a:graphicFrameLocks noChangeAspect="1"/>
@@ -3855,7 +3855,7 @@
                   <pic:spPr>
                     <a:xfrm>
                       <a:off x="0" y="0"/>
-                      <a:ext cx="7335981" cy="4218709"/>
+                      <a:ext cx="5472000" cy="3146788"/>
                     </a:xfrm>
                     <a:prstGeom prst="rect"/>
                   </pic:spPr>
@@ -4748,7 +4748,7 @@
       <w:r>
         <w:drawing>
           <wp:inline xmlns:a="http://schemas.openxmlformats.org/drawingml/2006/main" xmlns:pic="http://schemas.openxmlformats.org/drawingml/2006/picture">
-            <wp:extent cx="7518861" cy="4401589"/>
+            <wp:extent cx="5472000" cy="3203344"/>
             <wp:docPr id="1858245152" name="Picture 1858245152"/>
             <wp:cNvGraphicFramePr>
               <a:graphicFrameLocks noChangeAspect="1"/>
@@ -4769,7 +4769,7 @@
                   <pic:spPr>
                     <a:xfrm>
                       <a:off x="0" y="0"/>
-                      <a:ext cx="7518861" cy="4401589"/>
+                      <a:ext cx="5472000" cy="3203344"/>
                     </a:xfrm>
                     <a:prstGeom prst="rect"/>
                   </pic:spPr>
@@ -4820,7 +4820,7 @@
       <w:r>
         <w:drawing>
           <wp:inline xmlns:a="http://schemas.openxmlformats.org/drawingml/2006/main" xmlns:pic="http://schemas.openxmlformats.org/drawingml/2006/picture">
-            <wp:extent cx="6783185" cy="4563687"/>
+            <wp:extent cx="5472000" cy="3681529"/>
             <wp:docPr id="1858245153" name="Picture 1858245153"/>
             <wp:cNvGraphicFramePr>
               <a:graphicFrameLocks noChangeAspect="1"/>
@@ -4841,7 +4841,7 @@
                   <pic:spPr>
                     <a:xfrm>
                       <a:off x="0" y="0"/>
-                      <a:ext cx="6783185" cy="4563687"/>
+                      <a:ext cx="5472000" cy="3681529"/>
                     </a:xfrm>
                     <a:prstGeom prst="rect"/>
                   </pic:spPr>
@@ -5354,7 +5354,7 @@
       <w:r>
         <w:drawing>
           <wp:inline xmlns:a="http://schemas.openxmlformats.org/drawingml/2006/main" xmlns:pic="http://schemas.openxmlformats.org/drawingml/2006/picture">
-            <wp:extent cx="8246225" cy="3121429"/>
+            <wp:extent cx="5472000" cy="2071307"/>
             <wp:docPr id="1858245154" name="Picture 1858245154"/>
             <wp:cNvGraphicFramePr>
               <a:graphicFrameLocks noChangeAspect="1"/>
@@ -5375,7 +5375,7 @@
                   <pic:spPr>
                     <a:xfrm>
                       <a:off x="0" y="0"/>
-                      <a:ext cx="8246225" cy="3121429"/>
+                      <a:ext cx="5472000" cy="2071307"/>
                     </a:xfrm>
                     <a:prstGeom prst="rect"/>
                   </pic:spPr>
@@ -5596,7 +5596,7 @@
       <w:r>
         <w:drawing>
           <wp:inline xmlns:a="http://schemas.openxmlformats.org/drawingml/2006/main" xmlns:pic="http://schemas.openxmlformats.org/drawingml/2006/picture">
-            <wp:extent cx="4060767" cy="5469774"/>
+            <wp:extent cx="3340805" cy="4499999"/>
             <wp:docPr id="1858245155" name="Picture 1858245155"/>
             <wp:cNvGraphicFramePr>
               <a:graphicFrameLocks noChangeAspect="1"/>
@@ -5617,7 +5617,7 @@
                   <pic:spPr>
                     <a:xfrm>
                       <a:off x="0" y="0"/>
-                      <a:ext cx="4060767" cy="5469774"/>
+                      <a:ext cx="3340805" cy="4499999"/>
                     </a:xfrm>
                     <a:prstGeom prst="rect"/>
                   </pic:spPr>

</xml_diff>